<commit_message>
concertando uns erros e commitando documentação
</commit_message>
<xml_diff>
--- a/Tp-LAC-Processador-em-verilog.docx
+++ b/Tp-LAC-Processador-em-verilog.docx
@@ -3099,7 +3099,7 @@
         <w:t>4. TABELA VERDADE DA UNIDADE DE CONTROLE</w:t>
       </w:r>
     </w:p>
-    <w:p xmlns:wp14="http://schemas.microsoft.com/office/word/2010/wordml" wp14:paraId="44DC7FDE" wp14:textId="6942DAE8">
+    <w:p xmlns:wp14="http://schemas.microsoft.com/office/word/2010/wordml" wp14:paraId="44DC7FDE" wp14:textId="6CBE191E">
       <w:pPr>
         <w:spacing w:before="0" w:beforeAutospacing="off"/>
         <w:rPr>
@@ -3170,55 +3170,7 @@
           <w:szCs w:val="24"/>
           <w:lang w:val="pt-BR"/>
         </w:rPr>
-        <w:t xml:space="preserve"> (bits [6:0] da instrução), ela dita o comportamento de todos os multiplexadores e portas de escrita do sistema. Para garantir síntese lógica limpa e evitar a inferência indesejada de </w:t>
-      </w:r>
-      <w:r>
-        <w:rPr>
-          <w:rFonts w:ascii="Aptos" w:hAnsi="Aptos" w:eastAsia="Aptos" w:cs="Aptos"/>
-          <w:i w:val="0"/>
-          <w:iCs w:val="0"/>
-          <w:noProof w:val="0"/>
-          <w:sz w:val="24"/>
-          <w:szCs w:val="24"/>
-          <w:lang w:val="pt-BR"/>
-        </w:rPr>
-        <w:t>latches</w:t>
-      </w:r>
-      <w:r>
-        <w:rPr>
-          <w:rFonts w:ascii="Aptos" w:hAnsi="Aptos" w:eastAsia="Aptos" w:cs="Aptos"/>
-          <w:i w:val="0"/>
-          <w:iCs w:val="0"/>
-          <w:noProof w:val="0"/>
-          <w:sz w:val="24"/>
-          <w:szCs w:val="24"/>
-          <w:lang w:val="pt-BR"/>
-        </w:rPr>
-        <w:t>, todos os sinais possuem inicializações padrão (</w:t>
-      </w:r>
-      <w:r>
-        <w:rPr>
-          <w:rFonts w:ascii="Aptos" w:hAnsi="Aptos" w:eastAsia="Aptos" w:cs="Aptos"/>
-          <w:i w:val="0"/>
-          <w:iCs w:val="0"/>
-          <w:noProof w:val="0"/>
-          <w:sz w:val="24"/>
-          <w:szCs w:val="24"/>
-          <w:lang w:val="pt-BR"/>
-        </w:rPr>
-        <w:t>defaults</w:t>
-      </w:r>
-      <w:r>
-        <w:rPr>
-          <w:rFonts w:ascii="Aptos" w:hAnsi="Aptos" w:eastAsia="Aptos" w:cs="Aptos"/>
-          <w:i w:val="0"/>
-          <w:iCs w:val="0"/>
-          <w:noProof w:val="0"/>
-          <w:sz w:val="24"/>
-          <w:szCs w:val="24"/>
-          <w:lang w:val="pt-BR"/>
-        </w:rPr>
-        <w:t>) em zero no topo do bloco.</w:t>
+        <w:t xml:space="preserve"> (bits [6:0] da instrução), ela dita o comportamento de todos os multiplexadores e portas de escrita do sistema.</w:t>
       </w:r>
     </w:p>
     <w:tbl>
@@ -7482,7 +7434,79 @@
           <w:szCs w:val="24"/>
           <w:lang w:val="pt-BR"/>
         </w:rPr>
-        <w:t>A análise minuciosa dos vetores de teste injetados e das formas de onda extraídas do EPWave confirma que o processador RV32I Monociclo cumpre com rigor todas as especificações lógicas e restrições arquiteturais propostas no plano de trabalho prático. Todos os chaveamentos de multiplexadores combinacionais, barramentos de feedback e temporização estruturada dos blocos síncronos respondem perfeitamente. O hardware encontra-se maduro, validado e com 100% de cobertura das instruções exigidas, servindo como uma base sólida e homologada para a próxima etapa prática da disciplina: a inserção dos registradores de estágio para a construção do Pipeline e o desenvolvimento das unidades de tratamento de conflitos (hazards).</w:t>
+        <w:t>A análise do</w:t>
+      </w:r>
+      <w:r>
+        <w:rPr>
+          <w:rFonts w:ascii="Aptos" w:hAnsi="Aptos" w:eastAsia="Aptos" w:cs="Aptos"/>
+          <w:i w:val="0"/>
+          <w:iCs w:val="0"/>
+          <w:noProof w:val="0"/>
+          <w:sz w:val="24"/>
+          <w:szCs w:val="24"/>
+          <w:lang w:val="pt-BR"/>
+        </w:rPr>
+        <w:t>s</w:t>
+      </w:r>
+      <w:r>
+        <w:rPr>
+          <w:rFonts w:ascii="Aptos" w:hAnsi="Aptos" w:eastAsia="Aptos" w:cs="Aptos"/>
+          <w:i w:val="0"/>
+          <w:iCs w:val="0"/>
+          <w:noProof w:val="0"/>
+          <w:sz w:val="24"/>
+          <w:szCs w:val="24"/>
+          <w:lang w:val="pt-BR"/>
+        </w:rPr>
+        <w:t xml:space="preserve"> teste</w:t>
+      </w:r>
+      <w:r>
+        <w:rPr>
+          <w:rFonts w:ascii="Aptos" w:hAnsi="Aptos" w:eastAsia="Aptos" w:cs="Aptos"/>
+          <w:i w:val="0"/>
+          <w:iCs w:val="0"/>
+          <w:noProof w:val="0"/>
+          <w:sz w:val="24"/>
+          <w:szCs w:val="24"/>
+          <w:lang w:val="pt-BR"/>
+        </w:rPr>
+        <w:t>s</w:t>
+      </w:r>
+      <w:r>
+        <w:rPr>
+          <w:rFonts w:ascii="Aptos" w:hAnsi="Aptos" w:eastAsia="Aptos" w:cs="Aptos"/>
+          <w:i w:val="0"/>
+          <w:iCs w:val="0"/>
+          <w:noProof w:val="0"/>
+          <w:sz w:val="24"/>
+          <w:szCs w:val="24"/>
+          <w:lang w:val="pt-BR"/>
+        </w:rPr>
+        <w:t xml:space="preserve"> injetados e das formas de onda extraídas do </w:t>
+      </w:r>
+      <w:r>
+        <w:rPr>
+          <w:rFonts w:ascii="Aptos" w:hAnsi="Aptos" w:eastAsia="Aptos" w:cs="Aptos"/>
+          <w:i w:val="0"/>
+          <w:iCs w:val="0"/>
+          <w:noProof w:val="0"/>
+          <w:sz w:val="24"/>
+          <w:szCs w:val="24"/>
+          <w:lang w:val="pt-BR"/>
+        </w:rPr>
+        <w:t>EPWave</w:t>
+      </w:r>
+      <w:r>
+        <w:rPr>
+          <w:rFonts w:ascii="Aptos" w:hAnsi="Aptos" w:eastAsia="Aptos" w:cs="Aptos"/>
+          <w:i w:val="0"/>
+          <w:iCs w:val="0"/>
+          <w:noProof w:val="0"/>
+          <w:sz w:val="24"/>
+          <w:szCs w:val="24"/>
+          <w:lang w:val="pt-BR"/>
+        </w:rPr>
+        <w:t xml:space="preserve"> confirma que o processador RV32I Monociclo cumpre com rigor todas as especificações lógicas e restrições arquiteturais propostas no plano de trabalho prático. Todos os chaveamentos de multiplexadores combinacionais, barramentos de feedback e temporização estruturada dos blocos síncronos respondem perfeitamente. O hardware encontra-se, validado e com 100% de cobertura das instruções exigidas, servindo como uma base sólida.</w:t>
       </w:r>
     </w:p>
     <w:p>

</xml_diff>